<commit_message>
Update CVOCD Configuration Spec.docx
</commit_message>
<xml_diff>
--- a/docs/CVOCD Configuration Spec.docx
+++ b/docs/CVOCD Configuration Spec.docx
@@ -1,6 +1,6 @@
 
 <file path=word/document.xml><?xml version="1.0" encoding="utf-8"?>
-<w:document xmlns:wpc="http://schemas.microsoft.com/office/word/2010/wordprocessingCanvas" xmlns:cx="http://schemas.microsoft.com/office/drawing/2014/chartex" xmlns:cx1="http://schemas.microsoft.com/office/drawing/2015/9/8/chartex" xmlns:cx2="http://schemas.microsoft.com/office/drawing/2015/10/21/chartex" xmlns:cx3="http://schemas.microsoft.com/office/drawing/2016/5/9/chartex" xmlns:cx4="http://schemas.microsoft.com/office/drawing/2016/5/10/chartex" xmlns:cx5="http://schemas.microsoft.com/office/drawing/2016/5/11/chartex" xmlns:cx6="http://schemas.microsoft.com/office/drawing/2016/5/12/chartex" xmlns:cx7="http://schemas.microsoft.com/office/drawing/2016/5/13/chartex" xmlns:cx8="http://schemas.microsoft.com/office/drawing/2016/5/14/chartex" xmlns:mc="http://schemas.openxmlformats.org/markup-compatibility/2006" xmlns:aink="http://schemas.microsoft.com/office/drawing/2016/ink" xmlns:am3d="http://schemas.microsoft.com/office/drawing/2017/model3d" xmlns:o="urn:schemas-microsoft-com:office:office" xmlns:r="http://schemas.openxmlformats.org/officeDocument/2006/relationships" xmlns:m="http://schemas.openxmlformats.org/officeDocument/2006/math" xmlns:v="urn:schemas-microsoft-com:vml" xmlns:wp14="http://schemas.microsoft.com/office/word/2010/wordprocessingDrawing" xmlns:wp="http://schemas.openxmlformats.org/drawingml/2006/wordprocessingDrawing" xmlns:w10="urn:schemas-microsoft-com:office:word" xmlns:w="http://schemas.openxmlformats.org/wordprocessingml/2006/main" xmlns:w14="http://schemas.microsoft.com/office/word/2010/wordml" xmlns:w15="http://schemas.microsoft.com/office/word/2012/wordml" xmlns:w16cid="http://schemas.microsoft.com/office/word/2016/wordml/cid" xmlns:w16se="http://schemas.microsoft.com/office/word/2015/wordml/symex" xmlns:wpg="http://schemas.microsoft.com/office/word/2010/wordprocessingGroup" xmlns:wpi="http://schemas.microsoft.com/office/word/2010/wordprocessingInk" xmlns:wne="http://schemas.microsoft.com/office/word/2006/wordml" xmlns:wps="http://schemas.microsoft.com/office/word/2010/wordprocessingShape" mc:Ignorable="w14 w15 w16se w16cid wp14">
+<w:document xmlns:wpc="http://schemas.microsoft.com/office/word/2010/wordprocessingCanvas" xmlns:cx="http://schemas.microsoft.com/office/drawing/2014/chartex" xmlns:cx1="http://schemas.microsoft.com/office/drawing/2015/9/8/chartex" xmlns:cx2="http://schemas.microsoft.com/office/drawing/2015/10/21/chartex" xmlns:cx3="http://schemas.microsoft.com/office/drawing/2016/5/9/chartex" xmlns:cx4="http://schemas.microsoft.com/office/drawing/2016/5/10/chartex" xmlns:cx5="http://schemas.microsoft.com/office/drawing/2016/5/11/chartex" xmlns:cx6="http://schemas.microsoft.com/office/drawing/2016/5/12/chartex" xmlns:cx7="http://schemas.microsoft.com/office/drawing/2016/5/13/chartex" xmlns:cx8="http://schemas.microsoft.com/office/drawing/2016/5/14/chartex" xmlns:mc="http://schemas.openxmlformats.org/markup-compatibility/2006" xmlns:aink="http://schemas.microsoft.com/office/drawing/2016/ink" xmlns:am3d="http://schemas.microsoft.com/office/drawing/2017/model3d" xmlns:o="urn:schemas-microsoft-com:office:office" xmlns:oel="http://schemas.microsoft.com/office/2019/extlst" xmlns:r="http://schemas.openxmlformats.org/officeDocument/2006/relationships" xmlns:m="http://schemas.openxmlformats.org/officeDocument/2006/math" xmlns:v="urn:schemas-microsoft-com:vml" xmlns:wp14="http://schemas.microsoft.com/office/word/2010/wordprocessingDrawing" xmlns:wp="http://schemas.openxmlformats.org/drawingml/2006/wordprocessingDrawing" xmlns:w10="urn:schemas-microsoft-com:office:word" xmlns:w="http://schemas.openxmlformats.org/wordprocessingml/2006/main" xmlns:w14="http://schemas.microsoft.com/office/word/2010/wordml" xmlns:w15="http://schemas.microsoft.com/office/word/2012/wordml" xmlns:w16cex="http://schemas.microsoft.com/office/word/2018/wordml/cex" xmlns:w16cid="http://schemas.microsoft.com/office/word/2016/wordml/cid" xmlns:w16="http://schemas.microsoft.com/office/word/2018/wordml" xmlns:w16du="http://schemas.microsoft.com/office/word/2023/wordml/word16du" xmlns:w16sdtdh="http://schemas.microsoft.com/office/word/2020/wordml/sdtdatahash" xmlns:w16sdtfl="http://schemas.microsoft.com/office/word/2024/wordml/sdtformatlock" xmlns:w16se="http://schemas.microsoft.com/office/word/2015/wordml/symex" xmlns:wpg="http://schemas.microsoft.com/office/word/2010/wordprocessingGroup" xmlns:wpi="http://schemas.microsoft.com/office/word/2010/wordprocessingInk" xmlns:wne="http://schemas.microsoft.com/office/word/2006/wordml" xmlns:wps="http://schemas.microsoft.com/office/word/2010/wordprocessingShape" mc:Ignorable="w14 w15 w16se w16cid w16 w16cex w16sdtdh w16sdtfl w16du wp14">
   <w:body>
     <w:p>
       <w:pPr>
@@ -14,16 +14,7 @@
           <w:sz w:val="18"/>
           <w:szCs w:val="18"/>
         </w:rPr>
-        <w:t>C</w:t>
-      </w:r>
-      <w:bookmarkStart w:id="0" w:name="_GoBack"/>
-      <w:bookmarkEnd w:id="0"/>
-      <w:r>
-        <w:rPr>
-          <w:sz w:val="18"/>
-          <w:szCs w:val="18"/>
-        </w:rPr>
-        <w:t xml:space="preserve">VOCD </w:t>
+        <w:t xml:space="preserve">CVOCD </w:t>
       </w:r>
     </w:p>
     <w:p>
@@ -216,14 +207,7 @@
                 <w:sz w:val="18"/>
                 <w:szCs w:val="18"/>
               </w:rPr>
-              <w:t xml:space="preserve"> Note Input #</w:t>
-            </w:r>
-            <w:r>
-              <w:rPr>
-                <w:sz w:val="18"/>
-                <w:szCs w:val="18"/>
-              </w:rPr>
-              <w:t>2</w:t>
+              <w:t xml:space="preserve"> Note Input #2</w:t>
             </w:r>
           </w:p>
           <w:p>
@@ -268,14 +252,7 @@
                 <w:sz w:val="18"/>
                 <w:szCs w:val="18"/>
               </w:rPr>
-              <w:t xml:space="preserve"> Note Input #</w:t>
-            </w:r>
-            <w:r>
-              <w:rPr>
-                <w:sz w:val="18"/>
-                <w:szCs w:val="18"/>
-              </w:rPr>
-              <w:t>3</w:t>
+              <w:t xml:space="preserve"> Note Input #3</w:t>
             </w:r>
           </w:p>
           <w:p>
@@ -304,34 +281,25 @@
                 <w:sz w:val="18"/>
                 <w:szCs w:val="18"/>
               </w:rPr>
-              <w:t xml:space="preserve"> = Note Input #</w:t>
-            </w:r>
-            <w:r>
-              <w:rPr>
-                <w:sz w:val="18"/>
-                <w:szCs w:val="18"/>
-              </w:rPr>
-              <w:t>4</w:t>
-            </w:r>
-          </w:p>
-        </w:tc>
-        <w:tc>
-          <w:tcPr>
-            <w:tcW w:w="1250" w:type="pct"/>
-          </w:tcPr>
-          <w:p>
-            <w:pPr>
-              <w:rPr>
-                <w:sz w:val="18"/>
-                <w:szCs w:val="18"/>
-                <w:highlight w:val="yellow"/>
-              </w:rPr>
-            </w:pPr>
-            <w:r>
-              <w:rPr>
-                <w:sz w:val="18"/>
-                <w:szCs w:val="18"/>
-                <w:highlight w:val="yellow"/>
+              <w:t xml:space="preserve"> = Note Input #4</w:t>
+            </w:r>
+          </w:p>
+        </w:tc>
+        <w:tc>
+          <w:tcPr>
+            <w:tcW w:w="1250" w:type="pct"/>
+          </w:tcPr>
+          <w:p>
+            <w:pPr>
+              <w:rPr>
+                <w:sz w:val="18"/>
+                <w:szCs w:val="18"/>
+              </w:rPr>
+            </w:pPr>
+            <w:r>
+              <w:rPr>
+                <w:sz w:val="18"/>
+                <w:szCs w:val="18"/>
               </w:rPr>
               <w:t xml:space="preserve">1 = Enable </w:t>
             </w:r>
@@ -346,14 +314,12 @@
               <w:rPr>
                 <w:sz w:val="18"/>
                 <w:szCs w:val="18"/>
-                <w:highlight w:val="yellow"/>
-              </w:rPr>
-            </w:pPr>
-            <w:r>
-              <w:rPr>
-                <w:sz w:val="18"/>
-                <w:szCs w:val="18"/>
-                <w:highlight w:val="yellow"/>
+              </w:rPr>
+            </w:pPr>
+            <w:r>
+              <w:rPr>
+                <w:sz w:val="18"/>
+                <w:szCs w:val="18"/>
               </w:rPr>
               <w:t>0 = OFF</w:t>
             </w:r>
@@ -363,14 +329,12 @@
               <w:rPr>
                 <w:sz w:val="18"/>
                 <w:szCs w:val="18"/>
-                <w:highlight w:val="yellow"/>
-              </w:rPr>
-            </w:pPr>
-            <w:r>
-              <w:rPr>
-                <w:sz w:val="18"/>
-                <w:szCs w:val="18"/>
-                <w:highlight w:val="yellow"/>
+              </w:rPr>
+            </w:pPr>
+            <w:r>
+              <w:rPr>
+                <w:sz w:val="18"/>
+                <w:szCs w:val="18"/>
               </w:rPr>
               <w:t>1 = ON</w:t>
             </w:r>
@@ -671,14 +635,7 @@
                 <w:sz w:val="18"/>
                 <w:szCs w:val="18"/>
               </w:rPr>
-              <w:t xml:space="preserve">7 = </w:t>
-            </w:r>
-            <w:r>
-              <w:rPr>
-                <w:sz w:val="18"/>
-                <w:szCs w:val="18"/>
-              </w:rPr>
-              <w:t>Pitch Bend Range</w:t>
+              <w:t>7 = Pitch Bend Range</w:t>
             </w:r>
           </w:p>
         </w:tc>
@@ -809,6 +766,183 @@
                 <w:sz w:val="18"/>
                 <w:szCs w:val="18"/>
               </w:rPr>
+              <w:t>1 = Lowest Note</w:t>
+            </w:r>
+          </w:p>
+          <w:p>
+            <w:pPr>
+              <w:rPr>
+                <w:sz w:val="18"/>
+                <w:szCs w:val="18"/>
+              </w:rPr>
+            </w:pPr>
+            <w:r>
+              <w:rPr>
+                <w:sz w:val="18"/>
+                <w:szCs w:val="18"/>
+              </w:rPr>
+              <w:t>3 = Highest Note</w:t>
+            </w:r>
+          </w:p>
+          <w:p>
+            <w:pPr>
+              <w:rPr>
+                <w:sz w:val="18"/>
+                <w:szCs w:val="18"/>
+              </w:rPr>
+            </w:pPr>
+            <w:r>
+              <w:rPr>
+                <w:sz w:val="18"/>
+                <w:szCs w:val="18"/>
+              </w:rPr>
+              <w:t>6 = 2 Note Cycle</w:t>
+            </w:r>
+          </w:p>
+          <w:p>
+            <w:pPr>
+              <w:rPr>
+                <w:sz w:val="18"/>
+                <w:szCs w:val="18"/>
+              </w:rPr>
+            </w:pPr>
+            <w:r>
+              <w:rPr>
+                <w:sz w:val="18"/>
+                <w:szCs w:val="18"/>
+              </w:rPr>
+              <w:t>7 = 3 Note Cycle</w:t>
+            </w:r>
+          </w:p>
+          <w:p>
+            <w:pPr>
+              <w:rPr>
+                <w:sz w:val="18"/>
+                <w:szCs w:val="18"/>
+              </w:rPr>
+            </w:pPr>
+            <w:r>
+              <w:rPr>
+                <w:sz w:val="18"/>
+                <w:szCs w:val="18"/>
+              </w:rPr>
+              <w:t>8 = 4 Note Cycle</w:t>
+            </w:r>
+          </w:p>
+          <w:p>
+            <w:pPr>
+              <w:rPr>
+                <w:strike/>
+                <w:sz w:val="18"/>
+                <w:szCs w:val="18"/>
+              </w:rPr>
+            </w:pPr>
+            <w:r>
+              <w:rPr>
+                <w:strike/>
+                <w:sz w:val="18"/>
+                <w:szCs w:val="18"/>
+              </w:rPr>
+              <w:t>9 = 2 Note Chord</w:t>
+            </w:r>
+          </w:p>
+          <w:p>
+            <w:pPr>
+              <w:rPr>
+                <w:strike/>
+                <w:sz w:val="18"/>
+                <w:szCs w:val="18"/>
+              </w:rPr>
+            </w:pPr>
+            <w:r>
+              <w:rPr>
+                <w:strike/>
+                <w:sz w:val="18"/>
+                <w:szCs w:val="18"/>
+              </w:rPr>
+              <w:t>10</w:t>
+            </w:r>
+            <w:r>
+              <w:rPr>
+                <w:strike/>
+                <w:sz w:val="18"/>
+                <w:szCs w:val="18"/>
+              </w:rPr>
+              <w:t>(0A)</w:t>
+            </w:r>
+            <w:r>
+              <w:rPr>
+                <w:strike/>
+                <w:sz w:val="18"/>
+                <w:szCs w:val="18"/>
+              </w:rPr>
+              <w:t xml:space="preserve"> = 3 Note Chord</w:t>
+            </w:r>
+          </w:p>
+          <w:p>
+            <w:pPr>
+              <w:rPr>
+                <w:sz w:val="18"/>
+                <w:szCs w:val="18"/>
+              </w:rPr>
+            </w:pPr>
+            <w:r>
+              <w:rPr>
+                <w:sz w:val="18"/>
+                <w:szCs w:val="18"/>
+              </w:rPr>
+              <w:t>11</w:t>
+            </w:r>
+            <w:r>
+              <w:rPr>
+                <w:sz w:val="18"/>
+                <w:szCs w:val="18"/>
+              </w:rPr>
+              <w:t xml:space="preserve">(0B) </w:t>
+            </w:r>
+            <w:r>
+              <w:rPr>
+                <w:sz w:val="18"/>
+                <w:szCs w:val="18"/>
+              </w:rPr>
+              <w:t xml:space="preserve">= </w:t>
+            </w:r>
+            <w:r>
+              <w:rPr>
+                <w:sz w:val="18"/>
+                <w:szCs w:val="18"/>
+              </w:rPr>
+              <w:t>Poly/</w:t>
+            </w:r>
+            <w:r>
+              <w:rPr>
+                <w:strike/>
+                <w:sz w:val="18"/>
+                <w:szCs w:val="18"/>
+              </w:rPr>
+              <w:t>4</w:t>
+            </w:r>
+            <w:r>
+              <w:rPr>
+                <w:strike/>
+                <w:sz w:val="18"/>
+                <w:szCs w:val="18"/>
+              </w:rPr>
+              <w:t xml:space="preserve"> Note Chord</w:t>
+            </w:r>
+          </w:p>
+          <w:p>
+            <w:pPr>
+              <w:rPr>
+                <w:sz w:val="18"/>
+                <w:szCs w:val="18"/>
+              </w:rPr>
+            </w:pPr>
+            <w:r>
+              <w:rPr>
+                <w:sz w:val="18"/>
+                <w:szCs w:val="18"/>
+              </w:rPr>
               <w:t>1</w:t>
             </w:r>
             <w:r>
@@ -816,23 +950,39 @@
                 <w:sz w:val="18"/>
                 <w:szCs w:val="18"/>
               </w:rPr>
-              <w:t xml:space="preserve"> = </w:t>
-            </w:r>
-            <w:r>
-              <w:rPr>
-                <w:sz w:val="18"/>
-                <w:szCs w:val="18"/>
-              </w:rPr>
-              <w:t>Lowest Note</w:t>
-            </w:r>
-          </w:p>
-          <w:p>
-            <w:pPr>
-              <w:rPr>
-                <w:sz w:val="18"/>
-                <w:szCs w:val="18"/>
-              </w:rPr>
-            </w:pPr>
+              <w:t>2</w:t>
+            </w:r>
+            <w:r>
+              <w:rPr>
+                <w:sz w:val="18"/>
+                <w:szCs w:val="18"/>
+              </w:rPr>
+              <w:t xml:space="preserve">(0B) = </w:t>
+            </w:r>
+            <w:proofErr w:type="spellStart"/>
+            <w:r>
+              <w:rPr>
+                <w:sz w:val="18"/>
+                <w:szCs w:val="18"/>
+              </w:rPr>
+              <w:t>Paraphonic</w:t>
+            </w:r>
+            <w:proofErr w:type="spellEnd"/>
+          </w:p>
+          <w:p>
+            <w:pPr>
+              <w:rPr>
+                <w:sz w:val="18"/>
+                <w:szCs w:val="18"/>
+              </w:rPr>
+            </w:pPr>
+            <w:r>
+              <w:rPr>
+                <w:sz w:val="18"/>
+                <w:szCs w:val="18"/>
+              </w:rPr>
+              <w:t>1</w:t>
+            </w:r>
             <w:r>
               <w:rPr>
                 <w:sz w:val="18"/>
@@ -845,230 +995,21 @@
                 <w:sz w:val="18"/>
                 <w:szCs w:val="18"/>
               </w:rPr>
-              <w:t xml:space="preserve"> = </w:t>
-            </w:r>
-            <w:r>
-              <w:rPr>
-                <w:sz w:val="18"/>
-                <w:szCs w:val="18"/>
-              </w:rPr>
-              <w:t>Highest Note</w:t>
-            </w:r>
-          </w:p>
-          <w:p>
-            <w:pPr>
-              <w:rPr>
-                <w:sz w:val="18"/>
-                <w:szCs w:val="18"/>
-              </w:rPr>
-            </w:pPr>
-            <w:r>
-              <w:rPr>
-                <w:sz w:val="18"/>
-                <w:szCs w:val="18"/>
-              </w:rPr>
-              <w:t>6</w:t>
-            </w:r>
-            <w:r>
-              <w:rPr>
-                <w:sz w:val="18"/>
-                <w:szCs w:val="18"/>
-              </w:rPr>
-              <w:t xml:space="preserve"> = </w:t>
-            </w:r>
-            <w:r>
-              <w:rPr>
-                <w:sz w:val="18"/>
-                <w:szCs w:val="18"/>
-              </w:rPr>
-              <w:t>2 Note Cycle</w:t>
-            </w:r>
-          </w:p>
-          <w:p>
-            <w:pPr>
-              <w:rPr>
-                <w:sz w:val="18"/>
-                <w:szCs w:val="18"/>
-              </w:rPr>
-            </w:pPr>
-            <w:r>
-              <w:rPr>
-                <w:sz w:val="18"/>
-                <w:szCs w:val="18"/>
-              </w:rPr>
-              <w:t>7</w:t>
-            </w:r>
-            <w:r>
-              <w:rPr>
-                <w:sz w:val="18"/>
-                <w:szCs w:val="18"/>
-              </w:rPr>
-              <w:t xml:space="preserve"> = </w:t>
-            </w:r>
-            <w:r>
-              <w:rPr>
-                <w:sz w:val="18"/>
-                <w:szCs w:val="18"/>
-              </w:rPr>
-              <w:t>3</w:t>
-            </w:r>
-            <w:r>
-              <w:rPr>
-                <w:sz w:val="18"/>
-                <w:szCs w:val="18"/>
-              </w:rPr>
-              <w:t xml:space="preserve"> Note Cycle</w:t>
-            </w:r>
-          </w:p>
-          <w:p>
-            <w:pPr>
-              <w:rPr>
-                <w:sz w:val="18"/>
-                <w:szCs w:val="18"/>
-              </w:rPr>
-            </w:pPr>
-            <w:r>
-              <w:rPr>
-                <w:sz w:val="18"/>
-                <w:szCs w:val="18"/>
-              </w:rPr>
-              <w:t>8</w:t>
-            </w:r>
-            <w:r>
-              <w:rPr>
-                <w:sz w:val="18"/>
-                <w:szCs w:val="18"/>
-              </w:rPr>
-              <w:t xml:space="preserve"> = </w:t>
-            </w:r>
-            <w:r>
-              <w:rPr>
-                <w:sz w:val="18"/>
-                <w:szCs w:val="18"/>
-              </w:rPr>
-              <w:t>4</w:t>
-            </w:r>
-            <w:r>
-              <w:rPr>
-                <w:sz w:val="18"/>
-                <w:szCs w:val="18"/>
-              </w:rPr>
-              <w:t xml:space="preserve"> Note Cycle</w:t>
-            </w:r>
-          </w:p>
-          <w:p>
-            <w:pPr>
-              <w:rPr>
-                <w:sz w:val="18"/>
-                <w:szCs w:val="18"/>
-              </w:rPr>
-            </w:pPr>
-            <w:r>
-              <w:rPr>
-                <w:sz w:val="18"/>
-                <w:szCs w:val="18"/>
-              </w:rPr>
-              <w:t>9</w:t>
-            </w:r>
-            <w:r>
-              <w:rPr>
-                <w:sz w:val="18"/>
-                <w:szCs w:val="18"/>
-              </w:rPr>
-              <w:t xml:space="preserve"> = </w:t>
-            </w:r>
-            <w:r>
-              <w:rPr>
-                <w:sz w:val="18"/>
-                <w:szCs w:val="18"/>
-              </w:rPr>
-              <w:t>2 Note Chord</w:t>
-            </w:r>
-          </w:p>
-          <w:p>
-            <w:pPr>
-              <w:rPr>
-                <w:sz w:val="18"/>
-                <w:szCs w:val="18"/>
-              </w:rPr>
-            </w:pPr>
-            <w:r>
-              <w:rPr>
-                <w:sz w:val="18"/>
-                <w:szCs w:val="18"/>
-              </w:rPr>
-              <w:t>10</w:t>
-            </w:r>
-            <w:r>
-              <w:rPr>
-                <w:sz w:val="18"/>
-                <w:szCs w:val="18"/>
-              </w:rPr>
-              <w:t>(0A)</w:t>
-            </w:r>
-            <w:r>
-              <w:rPr>
-                <w:sz w:val="18"/>
-                <w:szCs w:val="18"/>
-              </w:rPr>
-              <w:t xml:space="preserve"> = </w:t>
-            </w:r>
-            <w:r>
-              <w:rPr>
-                <w:sz w:val="18"/>
-                <w:szCs w:val="18"/>
-              </w:rPr>
-              <w:t>3</w:t>
-            </w:r>
-            <w:r>
-              <w:rPr>
-                <w:sz w:val="18"/>
-                <w:szCs w:val="18"/>
-              </w:rPr>
-              <w:t xml:space="preserve"> Note Chord</w:t>
-            </w:r>
-          </w:p>
-          <w:p>
-            <w:pPr>
-              <w:rPr>
-                <w:sz w:val="18"/>
-                <w:szCs w:val="18"/>
-              </w:rPr>
-            </w:pPr>
-            <w:r>
-              <w:rPr>
-                <w:sz w:val="18"/>
-                <w:szCs w:val="18"/>
-              </w:rPr>
-              <w:t>11</w:t>
-            </w:r>
-            <w:r>
-              <w:rPr>
-                <w:sz w:val="18"/>
-                <w:szCs w:val="18"/>
-              </w:rPr>
-              <w:t xml:space="preserve">(0B) </w:t>
-            </w:r>
-            <w:r>
-              <w:rPr>
-                <w:sz w:val="18"/>
-                <w:szCs w:val="18"/>
-              </w:rPr>
-              <w:t xml:space="preserve">= </w:t>
-            </w:r>
-            <w:r>
-              <w:rPr>
-                <w:sz w:val="18"/>
-                <w:szCs w:val="18"/>
-              </w:rPr>
-              <w:t>4</w:t>
-            </w:r>
-            <w:r>
-              <w:rPr>
-                <w:sz w:val="18"/>
-                <w:szCs w:val="18"/>
-              </w:rPr>
-              <w:t xml:space="preserve"> Note Chord</w:t>
+              <w:t xml:space="preserve">(0B) = </w:t>
+            </w:r>
+            <w:r>
+              <w:rPr>
+                <w:sz w:val="18"/>
+                <w:szCs w:val="18"/>
+              </w:rPr>
+              <w:t>Par</w:t>
+            </w:r>
+            <w:r>
+              <w:rPr>
+                <w:sz w:val="18"/>
+                <w:szCs w:val="18"/>
+              </w:rPr>
+              <w:t>a. Release</w:t>
             </w:r>
           </w:p>
         </w:tc>
@@ -1260,49 +1201,14 @@
                 <w:sz w:val="18"/>
                 <w:szCs w:val="18"/>
               </w:rPr>
-              <w:t>(1</w:t>
-            </w:r>
-            <w:r>
-              <w:rPr>
-                <w:sz w:val="18"/>
-                <w:szCs w:val="18"/>
-              </w:rPr>
-              <w:t>6</w:t>
-            </w:r>
-            <w:r>
-              <w:rPr>
-                <w:sz w:val="18"/>
-                <w:szCs w:val="18"/>
-              </w:rPr>
-              <w:t>)</w:t>
-            </w:r>
-            <w:r>
-              <w:rPr>
-                <w:sz w:val="18"/>
-                <w:szCs w:val="18"/>
-              </w:rPr>
-              <w:t xml:space="preserve"> – </w:t>
-            </w:r>
-            <w:r>
-              <w:rPr>
-                <w:sz w:val="18"/>
-                <w:szCs w:val="18"/>
-              </w:rPr>
-              <w:t xml:space="preserve">CV </w:t>
-            </w:r>
-            <w:r>
-              <w:rPr>
-                <w:sz w:val="18"/>
-                <w:szCs w:val="18"/>
-              </w:rPr>
-              <w:t xml:space="preserve">Port </w:t>
-            </w:r>
-            <w:r>
-              <w:rPr>
-                <w:sz w:val="18"/>
-                <w:szCs w:val="18"/>
-              </w:rPr>
-              <w:t>B</w:t>
+              <w:t>(16)</w:t>
+            </w:r>
+            <w:r>
+              <w:rPr>
+                <w:sz w:val="18"/>
+                <w:szCs w:val="18"/>
+              </w:rPr>
+              <w:t xml:space="preserve"> – CV Port B</w:t>
             </w:r>
           </w:p>
           <w:p>
@@ -1324,49 +1230,14 @@
                 <w:sz w:val="18"/>
                 <w:szCs w:val="18"/>
               </w:rPr>
-              <w:t>(1</w:t>
-            </w:r>
-            <w:r>
-              <w:rPr>
-                <w:sz w:val="18"/>
-                <w:szCs w:val="18"/>
-              </w:rPr>
-              <w:t>7</w:t>
-            </w:r>
-            <w:r>
-              <w:rPr>
-                <w:sz w:val="18"/>
-                <w:szCs w:val="18"/>
-              </w:rPr>
-              <w:t>)</w:t>
-            </w:r>
-            <w:r>
-              <w:rPr>
-                <w:sz w:val="18"/>
-                <w:szCs w:val="18"/>
-              </w:rPr>
-              <w:t xml:space="preserve"> – </w:t>
-            </w:r>
-            <w:r>
-              <w:rPr>
-                <w:sz w:val="18"/>
-                <w:szCs w:val="18"/>
-              </w:rPr>
-              <w:t xml:space="preserve">CV </w:t>
-            </w:r>
-            <w:r>
-              <w:rPr>
-                <w:sz w:val="18"/>
-                <w:szCs w:val="18"/>
-              </w:rPr>
-              <w:t xml:space="preserve">Port </w:t>
-            </w:r>
-            <w:r>
-              <w:rPr>
-                <w:sz w:val="18"/>
-                <w:szCs w:val="18"/>
-              </w:rPr>
-              <w:t>C</w:t>
+              <w:t>(17)</w:t>
+            </w:r>
+            <w:r>
+              <w:rPr>
+                <w:sz w:val="18"/>
+                <w:szCs w:val="18"/>
+              </w:rPr>
+              <w:t xml:space="preserve"> – CV Port C</w:t>
             </w:r>
           </w:p>
           <w:p>
@@ -1388,49 +1259,14 @@
                 <w:sz w:val="18"/>
                 <w:szCs w:val="18"/>
               </w:rPr>
-              <w:t>(1</w:t>
-            </w:r>
-            <w:r>
-              <w:rPr>
-                <w:sz w:val="18"/>
-                <w:szCs w:val="18"/>
-              </w:rPr>
-              <w:t>8</w:t>
-            </w:r>
-            <w:r>
-              <w:rPr>
-                <w:sz w:val="18"/>
-                <w:szCs w:val="18"/>
-              </w:rPr>
-              <w:t>)</w:t>
-            </w:r>
-            <w:r>
-              <w:rPr>
-                <w:sz w:val="18"/>
-                <w:szCs w:val="18"/>
-              </w:rPr>
-              <w:t xml:space="preserve"> – </w:t>
-            </w:r>
-            <w:r>
-              <w:rPr>
-                <w:sz w:val="18"/>
-                <w:szCs w:val="18"/>
-              </w:rPr>
-              <w:t xml:space="preserve">CV </w:t>
-            </w:r>
-            <w:r>
-              <w:rPr>
-                <w:sz w:val="18"/>
-                <w:szCs w:val="18"/>
-              </w:rPr>
-              <w:t xml:space="preserve">Port </w:t>
-            </w:r>
-            <w:r>
-              <w:rPr>
-                <w:sz w:val="18"/>
-                <w:szCs w:val="18"/>
-              </w:rPr>
-              <w:t>D</w:t>
+              <w:t>(18)</w:t>
+            </w:r>
+            <w:r>
+              <w:rPr>
+                <w:sz w:val="18"/>
+                <w:szCs w:val="18"/>
+              </w:rPr>
+              <w:t xml:space="preserve"> – CV Port D</w:t>
             </w:r>
           </w:p>
         </w:tc>
@@ -1451,14 +1287,7 @@
                 <w:sz w:val="18"/>
                 <w:szCs w:val="18"/>
               </w:rPr>
-              <w:t>1</w:t>
-            </w:r>
-            <w:r>
-              <w:rPr>
-                <w:sz w:val="18"/>
-                <w:szCs w:val="18"/>
-              </w:rPr>
-              <w:t xml:space="preserve"> - Source</w:t>
+              <w:t>1 - Source</w:t>
             </w:r>
           </w:p>
         </w:tc>
@@ -1584,21 +1413,7 @@
                 <w:sz w:val="18"/>
                 <w:szCs w:val="18"/>
               </w:rPr>
-              <w:t>CC Number (</w:t>
-            </w:r>
-            <w:r>
-              <w:rPr>
-                <w:sz w:val="18"/>
-                <w:szCs w:val="18"/>
-              </w:rPr>
-              <w:t>0-127</w:t>
-            </w:r>
-            <w:r>
-              <w:rPr>
-                <w:sz w:val="18"/>
-                <w:szCs w:val="18"/>
-              </w:rPr>
-              <w:t>)</w:t>
+              <w:t>CC Number (0-127)</w:t>
             </w:r>
           </w:p>
         </w:tc>
@@ -1840,21 +1655,7 @@
                 <w:sz w:val="18"/>
                 <w:szCs w:val="18"/>
               </w:rPr>
-              <w:t>(0</w:t>
-            </w:r>
-            <w:r>
-              <w:rPr>
-                <w:sz w:val="18"/>
-                <w:szCs w:val="18"/>
-              </w:rPr>
-              <w:t>C</w:t>
-            </w:r>
-            <w:r>
-              <w:rPr>
-                <w:sz w:val="18"/>
-                <w:szCs w:val="18"/>
-              </w:rPr>
-              <w:t>)</w:t>
+              <w:t>(0C)</w:t>
             </w:r>
             <w:r>
               <w:rPr>
@@ -1883,21 +1684,7 @@
                 <w:sz w:val="18"/>
                 <w:szCs w:val="18"/>
               </w:rPr>
-              <w:t>(0</w:t>
-            </w:r>
-            <w:r>
-              <w:rPr>
-                <w:sz w:val="18"/>
-                <w:szCs w:val="18"/>
-              </w:rPr>
-              <w:t>D</w:t>
-            </w:r>
-            <w:r>
-              <w:rPr>
-                <w:sz w:val="18"/>
-                <w:szCs w:val="18"/>
-              </w:rPr>
-              <w:t>)</w:t>
+              <w:t>(0D)</w:t>
             </w:r>
             <w:r>
               <w:rPr>
@@ -1926,21 +1713,7 @@
                 <w:sz w:val="18"/>
                 <w:szCs w:val="18"/>
               </w:rPr>
-              <w:t>(0</w:t>
-            </w:r>
-            <w:r>
-              <w:rPr>
-                <w:sz w:val="18"/>
-                <w:szCs w:val="18"/>
-              </w:rPr>
-              <w:t>E</w:t>
-            </w:r>
-            <w:r>
-              <w:rPr>
-                <w:sz w:val="18"/>
-                <w:szCs w:val="18"/>
-              </w:rPr>
-              <w:t>)</w:t>
+              <w:t>(0E)</w:t>
             </w:r>
             <w:r>
               <w:rPr>
@@ -1982,100 +1755,37 @@
                 <w:sz w:val="18"/>
                 <w:szCs w:val="18"/>
               </w:rPr>
-              <w:t>2</w:t>
-            </w:r>
-            <w:r>
-              <w:rPr>
-                <w:sz w:val="18"/>
-                <w:szCs w:val="18"/>
-              </w:rPr>
-              <w:t xml:space="preserve"> – Note </w:t>
-            </w:r>
-            <w:r>
-              <w:rPr>
-                <w:sz w:val="18"/>
-                <w:szCs w:val="18"/>
-              </w:rPr>
-              <w:t>2</w:t>
-            </w:r>
-            <w:r>
-              <w:rPr>
-                <w:sz w:val="18"/>
-                <w:szCs w:val="18"/>
-              </w:rPr>
-              <w:t xml:space="preserve"> pitch</w:t>
-            </w:r>
-          </w:p>
-          <w:p>
-            <w:pPr>
-              <w:rPr>
-                <w:sz w:val="18"/>
-                <w:szCs w:val="18"/>
-              </w:rPr>
-            </w:pPr>
-            <w:r>
-              <w:rPr>
-                <w:sz w:val="18"/>
-                <w:szCs w:val="18"/>
-              </w:rPr>
-              <w:t>3</w:t>
-            </w:r>
-            <w:r>
-              <w:rPr>
-                <w:sz w:val="18"/>
-                <w:szCs w:val="18"/>
-              </w:rPr>
-              <w:t xml:space="preserve"> – Note </w:t>
-            </w:r>
-            <w:r>
-              <w:rPr>
-                <w:sz w:val="18"/>
-                <w:szCs w:val="18"/>
-              </w:rPr>
-              <w:t>3</w:t>
-            </w:r>
-            <w:r>
-              <w:rPr>
-                <w:sz w:val="18"/>
-                <w:szCs w:val="18"/>
-              </w:rPr>
-              <w:t xml:space="preserve"> pitch</w:t>
-            </w:r>
-          </w:p>
-          <w:p>
-            <w:pPr>
-              <w:rPr>
-                <w:sz w:val="18"/>
-                <w:szCs w:val="18"/>
-              </w:rPr>
-            </w:pPr>
-            <w:r>
-              <w:rPr>
-                <w:sz w:val="18"/>
-                <w:szCs w:val="18"/>
-              </w:rPr>
-              <w:t>4</w:t>
-            </w:r>
-            <w:r>
-              <w:rPr>
-                <w:sz w:val="18"/>
-                <w:szCs w:val="18"/>
-              </w:rPr>
-              <w:t xml:space="preserve"> – Note </w:t>
-            </w:r>
-            <w:r>
-              <w:rPr>
-                <w:sz w:val="18"/>
-                <w:szCs w:val="18"/>
-              </w:rPr>
-              <w:t>4</w:t>
-            </w:r>
-            <w:r>
-              <w:rPr>
-                <w:sz w:val="18"/>
-                <w:szCs w:val="18"/>
-              </w:rPr>
-              <w:t xml:space="preserve"> pitch</w:t>
+              <w:t>2 – Note 2 pitch</w:t>
+            </w:r>
+          </w:p>
+          <w:p>
+            <w:pPr>
+              <w:rPr>
+                <w:sz w:val="18"/>
+                <w:szCs w:val="18"/>
+              </w:rPr>
+            </w:pPr>
+            <w:r>
+              <w:rPr>
+                <w:sz w:val="18"/>
+                <w:szCs w:val="18"/>
+              </w:rPr>
+              <w:t>3 – Note 3 pitch</w:t>
+            </w:r>
+          </w:p>
+          <w:p>
+            <w:pPr>
+              <w:rPr>
+                <w:sz w:val="18"/>
+                <w:szCs w:val="18"/>
+              </w:rPr>
+            </w:pPr>
+            <w:r>
+              <w:rPr>
+                <w:sz w:val="18"/>
+                <w:szCs w:val="18"/>
+              </w:rPr>
+              <w:t>4 – Note 4 pitch</w:t>
             </w:r>
           </w:p>
           <w:p>
@@ -2168,28 +1878,7 @@
                 <w:sz w:val="18"/>
                 <w:szCs w:val="18"/>
               </w:rPr>
-              <w:t xml:space="preserve"> </w:t>
-            </w:r>
-            <w:r>
-              <w:rPr>
-                <w:sz w:val="18"/>
-                <w:szCs w:val="18"/>
-              </w:rPr>
-              <w:t>–</w:t>
-            </w:r>
-            <w:r>
-              <w:rPr>
-                <w:sz w:val="18"/>
-                <w:szCs w:val="18"/>
-              </w:rPr>
-              <w:t xml:space="preserve"> </w:t>
-            </w:r>
-            <w:r>
-              <w:rPr>
-                <w:sz w:val="18"/>
-                <w:szCs w:val="18"/>
-              </w:rPr>
-              <w:t>Scaled BPM</w:t>
+              <w:t xml:space="preserve"> – Scaled BPM</w:t>
             </w:r>
           </w:p>
           <w:p>
@@ -2346,14 +2035,7 @@
                 <w:sz w:val="18"/>
                 <w:szCs w:val="18"/>
               </w:rPr>
-              <w:t xml:space="preserve">2 = </w:t>
-            </w:r>
-            <w:r>
-              <w:rPr>
-                <w:sz w:val="18"/>
-                <w:szCs w:val="18"/>
-              </w:rPr>
-              <w:t>Chan</w:t>
+              <w:t>2 = Chan</w:t>
             </w:r>
           </w:p>
         </w:tc>
@@ -2393,21 +2075,7 @@
                 <w:sz w:val="18"/>
                 <w:szCs w:val="18"/>
               </w:rPr>
-              <w:t>Channel (</w:t>
-            </w:r>
-            <w:r>
-              <w:rPr>
-                <w:sz w:val="18"/>
-                <w:szCs w:val="18"/>
-              </w:rPr>
-              <w:t>1-16</w:t>
-            </w:r>
-            <w:r>
-              <w:rPr>
-                <w:sz w:val="18"/>
-                <w:szCs w:val="18"/>
-              </w:rPr>
-              <w:t>)</w:t>
+              <w:t>Channel (1-16)</w:t>
             </w:r>
           </w:p>
         </w:tc>
@@ -2457,28 +2125,7 @@
                 <w:sz w:val="18"/>
                 <w:szCs w:val="18"/>
               </w:rPr>
-              <w:t xml:space="preserve">1 = </w:t>
-            </w:r>
-            <w:r>
-              <w:rPr>
-                <w:sz w:val="18"/>
-                <w:szCs w:val="18"/>
-              </w:rPr>
-              <w:t>Any</w:t>
-            </w:r>
-            <w:r>
-              <w:rPr>
-                <w:sz w:val="18"/>
-                <w:szCs w:val="18"/>
-              </w:rPr>
-              <w:t>/</w:t>
-            </w:r>
-            <w:r>
-              <w:rPr>
-                <w:sz w:val="18"/>
-                <w:szCs w:val="18"/>
-              </w:rPr>
-              <w:t>Omni</w:t>
+              <w:t>1 = Any/Omni</w:t>
             </w:r>
           </w:p>
         </w:tc>
@@ -2548,14 +2195,7 @@
                 <w:sz w:val="18"/>
                 <w:szCs w:val="18"/>
               </w:rPr>
-              <w:t xml:space="preserve">2 = </w:t>
-            </w:r>
-            <w:r>
-              <w:rPr>
-                <w:sz w:val="18"/>
-                <w:szCs w:val="18"/>
-              </w:rPr>
-              <w:t>Global Channel</w:t>
+              <w:t>2 = Global Channel</w:t>
             </w:r>
           </w:p>
         </w:tc>
@@ -2680,14 +2320,7 @@
                 <w:sz w:val="18"/>
                 <w:szCs w:val="18"/>
               </w:rPr>
-              <w:t>mapped to -63 to +63</w:t>
-            </w:r>
-            <w:r>
-              <w:rPr>
-                <w:sz w:val="18"/>
-                <w:szCs w:val="18"/>
-              </w:rPr>
-              <w:t xml:space="preserve"> semitones</w:t>
+              <w:t>mapped to -63 to +63 semitones</w:t>
             </w:r>
           </w:p>
         </w:tc>
@@ -3121,6 +2754,7 @@
           <w:sz w:val="18"/>
           <w:szCs w:val="18"/>
         </w:rPr>
+        <w:lastRenderedPageBreak/>
         <w:t>Gate Output</w:t>
       </w:r>
     </w:p>
@@ -3154,7 +2788,6 @@
                 <w:sz w:val="18"/>
                 <w:szCs w:val="18"/>
               </w:rPr>
-              <w:lastRenderedPageBreak/>
               <w:t>NRPN MSB</w:t>
             </w:r>
           </w:p>
@@ -3270,448 +2903,224 @@
                 <w:sz w:val="18"/>
                 <w:szCs w:val="18"/>
               </w:rPr>
-              <w:t>3</w:t>
-            </w:r>
-            <w:r>
-              <w:rPr>
-                <w:sz w:val="18"/>
-                <w:szCs w:val="18"/>
-              </w:rPr>
-              <w:t>2</w:t>
-            </w:r>
-            <w:r>
-              <w:rPr>
-                <w:sz w:val="18"/>
-                <w:szCs w:val="18"/>
-              </w:rPr>
-              <w:t>(</w:t>
-            </w:r>
-            <w:r>
-              <w:rPr>
-                <w:sz w:val="18"/>
-                <w:szCs w:val="18"/>
-              </w:rPr>
-              <w:t>20</w:t>
-            </w:r>
-            <w:r>
-              <w:rPr>
-                <w:sz w:val="18"/>
-                <w:szCs w:val="18"/>
-              </w:rPr>
-              <w:t>)</w:t>
-            </w:r>
-            <w:r>
-              <w:rPr>
-                <w:sz w:val="18"/>
-                <w:szCs w:val="18"/>
-              </w:rPr>
-              <w:t xml:space="preserve"> = Gate </w:t>
-            </w:r>
-            <w:r>
-              <w:rPr>
-                <w:sz w:val="18"/>
-                <w:szCs w:val="18"/>
-              </w:rPr>
-              <w:t>2</w:t>
-            </w:r>
-          </w:p>
-          <w:p>
-            <w:pPr>
-              <w:rPr>
-                <w:sz w:val="18"/>
-                <w:szCs w:val="18"/>
-              </w:rPr>
-            </w:pPr>
-            <w:r>
-              <w:rPr>
-                <w:sz w:val="18"/>
-                <w:szCs w:val="18"/>
-              </w:rPr>
-              <w:t>3</w:t>
-            </w:r>
-            <w:r>
-              <w:rPr>
-                <w:sz w:val="18"/>
-                <w:szCs w:val="18"/>
-              </w:rPr>
-              <w:t>3</w:t>
-            </w:r>
-            <w:r>
-              <w:rPr>
-                <w:sz w:val="18"/>
-                <w:szCs w:val="18"/>
-              </w:rPr>
-              <w:t>(2</w:t>
-            </w:r>
-            <w:r>
-              <w:rPr>
-                <w:sz w:val="18"/>
-                <w:szCs w:val="18"/>
-              </w:rPr>
-              <w:t>1</w:t>
-            </w:r>
-            <w:r>
-              <w:rPr>
-                <w:sz w:val="18"/>
-                <w:szCs w:val="18"/>
-              </w:rPr>
-              <w:t>)</w:t>
-            </w:r>
-            <w:r>
-              <w:rPr>
-                <w:sz w:val="18"/>
-                <w:szCs w:val="18"/>
-              </w:rPr>
-              <w:t xml:space="preserve"> = Gate </w:t>
-            </w:r>
-            <w:r>
-              <w:rPr>
-                <w:sz w:val="18"/>
-                <w:szCs w:val="18"/>
-              </w:rPr>
-              <w:t>3</w:t>
-            </w:r>
-          </w:p>
-          <w:p>
-            <w:pPr>
-              <w:rPr>
-                <w:sz w:val="18"/>
-                <w:szCs w:val="18"/>
-              </w:rPr>
-            </w:pPr>
-            <w:r>
-              <w:rPr>
-                <w:sz w:val="18"/>
-                <w:szCs w:val="18"/>
-              </w:rPr>
-              <w:t>3</w:t>
-            </w:r>
-            <w:r>
-              <w:rPr>
-                <w:sz w:val="18"/>
-                <w:szCs w:val="18"/>
-              </w:rPr>
-              <w:t>4</w:t>
-            </w:r>
-            <w:r>
-              <w:rPr>
-                <w:sz w:val="18"/>
-                <w:szCs w:val="18"/>
-              </w:rPr>
-              <w:t>(2</w:t>
-            </w:r>
-            <w:r>
-              <w:rPr>
-                <w:sz w:val="18"/>
-                <w:szCs w:val="18"/>
-              </w:rPr>
-              <w:t>2</w:t>
-            </w:r>
-            <w:r>
-              <w:rPr>
-                <w:sz w:val="18"/>
-                <w:szCs w:val="18"/>
-              </w:rPr>
-              <w:t>)</w:t>
-            </w:r>
-            <w:r>
-              <w:rPr>
-                <w:sz w:val="18"/>
-                <w:szCs w:val="18"/>
-              </w:rPr>
-              <w:t xml:space="preserve"> = Gate </w:t>
-            </w:r>
-            <w:r>
-              <w:rPr>
-                <w:sz w:val="18"/>
-                <w:szCs w:val="18"/>
-              </w:rPr>
-              <w:t>4</w:t>
-            </w:r>
-          </w:p>
-          <w:p>
-            <w:pPr>
-              <w:rPr>
-                <w:sz w:val="18"/>
-                <w:szCs w:val="18"/>
-              </w:rPr>
-            </w:pPr>
-            <w:r>
-              <w:rPr>
-                <w:sz w:val="18"/>
-                <w:szCs w:val="18"/>
-              </w:rPr>
-              <w:t>3</w:t>
-            </w:r>
-            <w:r>
-              <w:rPr>
-                <w:sz w:val="18"/>
-                <w:szCs w:val="18"/>
-              </w:rPr>
-              <w:t>5</w:t>
-            </w:r>
-            <w:r>
-              <w:rPr>
-                <w:sz w:val="18"/>
-                <w:szCs w:val="18"/>
-              </w:rPr>
-              <w:t>(2</w:t>
-            </w:r>
-            <w:r>
-              <w:rPr>
-                <w:sz w:val="18"/>
-                <w:szCs w:val="18"/>
-              </w:rPr>
-              <w:t>3</w:t>
-            </w:r>
-            <w:r>
-              <w:rPr>
-                <w:sz w:val="18"/>
-                <w:szCs w:val="18"/>
-              </w:rPr>
-              <w:t>)</w:t>
-            </w:r>
-            <w:r>
-              <w:rPr>
-                <w:sz w:val="18"/>
-                <w:szCs w:val="18"/>
-              </w:rPr>
-              <w:t xml:space="preserve"> = Gate </w:t>
-            </w:r>
-            <w:r>
-              <w:rPr>
-                <w:sz w:val="18"/>
-                <w:szCs w:val="18"/>
-              </w:rPr>
-              <w:t>5</w:t>
-            </w:r>
-          </w:p>
-          <w:p>
-            <w:pPr>
-              <w:rPr>
-                <w:sz w:val="18"/>
-                <w:szCs w:val="18"/>
-              </w:rPr>
-            </w:pPr>
-            <w:r>
-              <w:rPr>
-                <w:sz w:val="18"/>
-                <w:szCs w:val="18"/>
-              </w:rPr>
-              <w:t>3</w:t>
-            </w:r>
-            <w:r>
-              <w:rPr>
-                <w:sz w:val="18"/>
-                <w:szCs w:val="18"/>
-              </w:rPr>
-              <w:t>6</w:t>
-            </w:r>
-            <w:r>
-              <w:rPr>
-                <w:sz w:val="18"/>
-                <w:szCs w:val="18"/>
-              </w:rPr>
-              <w:t>(2</w:t>
-            </w:r>
-            <w:r>
-              <w:rPr>
-                <w:sz w:val="18"/>
-                <w:szCs w:val="18"/>
-              </w:rPr>
-              <w:t>4</w:t>
-            </w:r>
-            <w:r>
-              <w:rPr>
-                <w:sz w:val="18"/>
-                <w:szCs w:val="18"/>
-              </w:rPr>
-              <w:t>)</w:t>
-            </w:r>
-            <w:r>
-              <w:rPr>
-                <w:sz w:val="18"/>
-                <w:szCs w:val="18"/>
-              </w:rPr>
-              <w:t xml:space="preserve"> = Gate </w:t>
-            </w:r>
-            <w:r>
-              <w:rPr>
-                <w:sz w:val="18"/>
-                <w:szCs w:val="18"/>
-              </w:rPr>
-              <w:t>6</w:t>
-            </w:r>
-          </w:p>
-          <w:p>
-            <w:pPr>
-              <w:rPr>
-                <w:sz w:val="18"/>
-                <w:szCs w:val="18"/>
-              </w:rPr>
-            </w:pPr>
-            <w:r>
-              <w:rPr>
-                <w:sz w:val="18"/>
-                <w:szCs w:val="18"/>
-              </w:rPr>
-              <w:t>3</w:t>
-            </w:r>
-            <w:r>
-              <w:rPr>
-                <w:sz w:val="18"/>
-                <w:szCs w:val="18"/>
-              </w:rPr>
-              <w:t>7</w:t>
-            </w:r>
-            <w:r>
-              <w:rPr>
-                <w:sz w:val="18"/>
-                <w:szCs w:val="18"/>
-              </w:rPr>
-              <w:t>(2</w:t>
-            </w:r>
-            <w:r>
-              <w:rPr>
-                <w:sz w:val="18"/>
-                <w:szCs w:val="18"/>
-              </w:rPr>
-              <w:t>5</w:t>
-            </w:r>
-            <w:r>
-              <w:rPr>
-                <w:sz w:val="18"/>
-                <w:szCs w:val="18"/>
-              </w:rPr>
-              <w:t>)</w:t>
-            </w:r>
-            <w:r>
-              <w:rPr>
-                <w:sz w:val="18"/>
-                <w:szCs w:val="18"/>
-              </w:rPr>
-              <w:t xml:space="preserve"> = Gate </w:t>
-            </w:r>
-            <w:r>
-              <w:rPr>
-                <w:sz w:val="18"/>
-                <w:szCs w:val="18"/>
-              </w:rPr>
-              <w:t>7</w:t>
-            </w:r>
-          </w:p>
-          <w:p>
-            <w:pPr>
-              <w:rPr>
-                <w:sz w:val="18"/>
-                <w:szCs w:val="18"/>
-              </w:rPr>
-            </w:pPr>
-            <w:r>
-              <w:rPr>
-                <w:sz w:val="18"/>
-                <w:szCs w:val="18"/>
-              </w:rPr>
-              <w:t>3</w:t>
-            </w:r>
-            <w:r>
-              <w:rPr>
-                <w:sz w:val="18"/>
-                <w:szCs w:val="18"/>
-              </w:rPr>
-              <w:t>8</w:t>
-            </w:r>
-            <w:r>
-              <w:rPr>
-                <w:sz w:val="18"/>
-                <w:szCs w:val="18"/>
-              </w:rPr>
-              <w:t>(2</w:t>
-            </w:r>
-            <w:r>
-              <w:rPr>
-                <w:sz w:val="18"/>
-                <w:szCs w:val="18"/>
-              </w:rPr>
-              <w:t>6</w:t>
-            </w:r>
-            <w:r>
-              <w:rPr>
-                <w:sz w:val="18"/>
-                <w:szCs w:val="18"/>
-              </w:rPr>
-              <w:t>)</w:t>
-            </w:r>
-            <w:r>
-              <w:rPr>
-                <w:sz w:val="18"/>
-                <w:szCs w:val="18"/>
-              </w:rPr>
-              <w:t xml:space="preserve"> = Gate </w:t>
-            </w:r>
-            <w:r>
-              <w:rPr>
-                <w:sz w:val="18"/>
-                <w:szCs w:val="18"/>
-              </w:rPr>
-              <w:t>8</w:t>
-            </w:r>
-          </w:p>
-          <w:p>
-            <w:pPr>
-              <w:rPr>
-                <w:sz w:val="18"/>
-                <w:szCs w:val="18"/>
-              </w:rPr>
-            </w:pPr>
-            <w:r>
-              <w:rPr>
-                <w:sz w:val="18"/>
-                <w:szCs w:val="18"/>
-              </w:rPr>
-              <w:t>3</w:t>
-            </w:r>
-            <w:r>
-              <w:rPr>
-                <w:sz w:val="18"/>
-                <w:szCs w:val="18"/>
-              </w:rPr>
-              <w:t>9</w:t>
-            </w:r>
-            <w:r>
-              <w:rPr>
-                <w:sz w:val="18"/>
-                <w:szCs w:val="18"/>
-              </w:rPr>
-              <w:t>(2</w:t>
-            </w:r>
-            <w:r>
-              <w:rPr>
-                <w:sz w:val="18"/>
-                <w:szCs w:val="18"/>
-              </w:rPr>
-              <w:t>7</w:t>
-            </w:r>
-            <w:r>
-              <w:rPr>
-                <w:sz w:val="18"/>
-                <w:szCs w:val="18"/>
-              </w:rPr>
-              <w:t>)</w:t>
-            </w:r>
-            <w:r>
-              <w:rPr>
-                <w:sz w:val="18"/>
-                <w:szCs w:val="18"/>
-              </w:rPr>
-              <w:t xml:space="preserve"> = Gate </w:t>
-            </w:r>
-            <w:r>
-              <w:rPr>
-                <w:sz w:val="18"/>
-                <w:szCs w:val="18"/>
-              </w:rPr>
-              <w:t>9</w:t>
+              <w:t>32</w:t>
+            </w:r>
+            <w:r>
+              <w:rPr>
+                <w:sz w:val="18"/>
+                <w:szCs w:val="18"/>
+              </w:rPr>
+              <w:t>(20)</w:t>
+            </w:r>
+            <w:r>
+              <w:rPr>
+                <w:sz w:val="18"/>
+                <w:szCs w:val="18"/>
+              </w:rPr>
+              <w:t xml:space="preserve"> = Gate 2</w:t>
+            </w:r>
+          </w:p>
+          <w:p>
+            <w:pPr>
+              <w:rPr>
+                <w:sz w:val="18"/>
+                <w:szCs w:val="18"/>
+              </w:rPr>
+            </w:pPr>
+            <w:r>
+              <w:rPr>
+                <w:sz w:val="18"/>
+                <w:szCs w:val="18"/>
+              </w:rPr>
+              <w:t>33</w:t>
+            </w:r>
+            <w:r>
+              <w:rPr>
+                <w:sz w:val="18"/>
+                <w:szCs w:val="18"/>
+              </w:rPr>
+              <w:t>(21)</w:t>
+            </w:r>
+            <w:r>
+              <w:rPr>
+                <w:sz w:val="18"/>
+                <w:szCs w:val="18"/>
+              </w:rPr>
+              <w:t xml:space="preserve"> = Gate 3</w:t>
+            </w:r>
+          </w:p>
+          <w:p>
+            <w:pPr>
+              <w:rPr>
+                <w:sz w:val="18"/>
+                <w:szCs w:val="18"/>
+              </w:rPr>
+            </w:pPr>
+            <w:r>
+              <w:rPr>
+                <w:sz w:val="18"/>
+                <w:szCs w:val="18"/>
+              </w:rPr>
+              <w:t>34</w:t>
+            </w:r>
+            <w:r>
+              <w:rPr>
+                <w:sz w:val="18"/>
+                <w:szCs w:val="18"/>
+              </w:rPr>
+              <w:t>(22)</w:t>
+            </w:r>
+            <w:r>
+              <w:rPr>
+                <w:sz w:val="18"/>
+                <w:szCs w:val="18"/>
+              </w:rPr>
+              <w:t xml:space="preserve"> = Gate 4</w:t>
+            </w:r>
+          </w:p>
+          <w:p>
+            <w:pPr>
+              <w:rPr>
+                <w:sz w:val="18"/>
+                <w:szCs w:val="18"/>
+              </w:rPr>
+            </w:pPr>
+            <w:r>
+              <w:rPr>
+                <w:sz w:val="18"/>
+                <w:szCs w:val="18"/>
+              </w:rPr>
+              <w:t>35</w:t>
+            </w:r>
+            <w:r>
+              <w:rPr>
+                <w:sz w:val="18"/>
+                <w:szCs w:val="18"/>
+              </w:rPr>
+              <w:t>(23)</w:t>
+            </w:r>
+            <w:r>
+              <w:rPr>
+                <w:sz w:val="18"/>
+                <w:szCs w:val="18"/>
+              </w:rPr>
+              <w:t xml:space="preserve"> = Gate 5</w:t>
+            </w:r>
+          </w:p>
+          <w:p>
+            <w:pPr>
+              <w:rPr>
+                <w:sz w:val="18"/>
+                <w:szCs w:val="18"/>
+              </w:rPr>
+            </w:pPr>
+            <w:r>
+              <w:rPr>
+                <w:sz w:val="18"/>
+                <w:szCs w:val="18"/>
+              </w:rPr>
+              <w:t>36</w:t>
+            </w:r>
+            <w:r>
+              <w:rPr>
+                <w:sz w:val="18"/>
+                <w:szCs w:val="18"/>
+              </w:rPr>
+              <w:t>(24)</w:t>
+            </w:r>
+            <w:r>
+              <w:rPr>
+                <w:sz w:val="18"/>
+                <w:szCs w:val="18"/>
+              </w:rPr>
+              <w:t xml:space="preserve"> = Gate 6</w:t>
+            </w:r>
+          </w:p>
+          <w:p>
+            <w:pPr>
+              <w:rPr>
+                <w:sz w:val="18"/>
+                <w:szCs w:val="18"/>
+              </w:rPr>
+            </w:pPr>
+            <w:r>
+              <w:rPr>
+                <w:sz w:val="18"/>
+                <w:szCs w:val="18"/>
+              </w:rPr>
+              <w:t>37</w:t>
+            </w:r>
+            <w:r>
+              <w:rPr>
+                <w:sz w:val="18"/>
+                <w:szCs w:val="18"/>
+              </w:rPr>
+              <w:t>(25)</w:t>
+            </w:r>
+            <w:r>
+              <w:rPr>
+                <w:sz w:val="18"/>
+                <w:szCs w:val="18"/>
+              </w:rPr>
+              <w:t xml:space="preserve"> = Gate 7</w:t>
+            </w:r>
+          </w:p>
+          <w:p>
+            <w:pPr>
+              <w:rPr>
+                <w:sz w:val="18"/>
+                <w:szCs w:val="18"/>
+              </w:rPr>
+            </w:pPr>
+            <w:r>
+              <w:rPr>
+                <w:sz w:val="18"/>
+                <w:szCs w:val="18"/>
+              </w:rPr>
+              <w:t>38</w:t>
+            </w:r>
+            <w:r>
+              <w:rPr>
+                <w:sz w:val="18"/>
+                <w:szCs w:val="18"/>
+              </w:rPr>
+              <w:t>(26)</w:t>
+            </w:r>
+            <w:r>
+              <w:rPr>
+                <w:sz w:val="18"/>
+                <w:szCs w:val="18"/>
+              </w:rPr>
+              <w:t xml:space="preserve"> = Gate 8</w:t>
+            </w:r>
+          </w:p>
+          <w:p>
+            <w:pPr>
+              <w:rPr>
+                <w:sz w:val="18"/>
+                <w:szCs w:val="18"/>
+              </w:rPr>
+            </w:pPr>
+            <w:r>
+              <w:rPr>
+                <w:sz w:val="18"/>
+                <w:szCs w:val="18"/>
+              </w:rPr>
+              <w:t>39</w:t>
+            </w:r>
+            <w:r>
+              <w:rPr>
+                <w:sz w:val="18"/>
+                <w:szCs w:val="18"/>
+              </w:rPr>
+              <w:t>(27)</w:t>
+            </w:r>
+            <w:r>
+              <w:rPr>
+                <w:sz w:val="18"/>
+                <w:szCs w:val="18"/>
+              </w:rPr>
+              <w:t xml:space="preserve"> = Gate 9</w:t>
             </w:r>
           </w:p>
           <w:p>
@@ -3733,35 +3142,14 @@
                 <w:sz w:val="18"/>
                 <w:szCs w:val="18"/>
               </w:rPr>
-              <w:t>(2</w:t>
-            </w:r>
-            <w:r>
-              <w:rPr>
-                <w:sz w:val="18"/>
-                <w:szCs w:val="18"/>
-              </w:rPr>
-              <w:t>8</w:t>
-            </w:r>
-            <w:r>
-              <w:rPr>
-                <w:sz w:val="18"/>
-                <w:szCs w:val="18"/>
-              </w:rPr>
-              <w:t>)</w:t>
-            </w:r>
-            <w:r>
-              <w:rPr>
-                <w:sz w:val="18"/>
-                <w:szCs w:val="18"/>
-              </w:rPr>
-              <w:t xml:space="preserve"> = Gate 1</w:t>
-            </w:r>
-            <w:r>
-              <w:rPr>
-                <w:sz w:val="18"/>
-                <w:szCs w:val="18"/>
-              </w:rPr>
-              <w:t>0</w:t>
+              <w:t>(28)</w:t>
+            </w:r>
+            <w:r>
+              <w:rPr>
+                <w:sz w:val="18"/>
+                <w:szCs w:val="18"/>
+              </w:rPr>
+              <w:t xml:space="preserve"> = Gate 10</w:t>
             </w:r>
           </w:p>
           <w:p>
@@ -3783,35 +3171,14 @@
                 <w:sz w:val="18"/>
                 <w:szCs w:val="18"/>
               </w:rPr>
-              <w:t>(2</w:t>
-            </w:r>
-            <w:r>
-              <w:rPr>
-                <w:sz w:val="18"/>
-                <w:szCs w:val="18"/>
-              </w:rPr>
-              <w:t>9</w:t>
-            </w:r>
-            <w:r>
-              <w:rPr>
-                <w:sz w:val="18"/>
-                <w:szCs w:val="18"/>
-              </w:rPr>
-              <w:t>)</w:t>
-            </w:r>
-            <w:r>
-              <w:rPr>
-                <w:sz w:val="18"/>
-                <w:szCs w:val="18"/>
-              </w:rPr>
-              <w:t xml:space="preserve"> = Gate 1</w:t>
-            </w:r>
-            <w:r>
-              <w:rPr>
-                <w:sz w:val="18"/>
-                <w:szCs w:val="18"/>
-              </w:rPr>
-              <w:t>1</w:t>
+              <w:t>(29)</w:t>
+            </w:r>
+            <w:r>
+              <w:rPr>
+                <w:sz w:val="18"/>
+                <w:szCs w:val="18"/>
+              </w:rPr>
+              <w:t xml:space="preserve"> = Gate 11</w:t>
             </w:r>
           </w:p>
           <w:p>
@@ -3833,35 +3200,14 @@
                 <w:sz w:val="18"/>
                 <w:szCs w:val="18"/>
               </w:rPr>
-              <w:t>(2</w:t>
-            </w:r>
-            <w:r>
-              <w:rPr>
-                <w:sz w:val="18"/>
-                <w:szCs w:val="18"/>
-              </w:rPr>
-              <w:t>A</w:t>
-            </w:r>
-            <w:r>
-              <w:rPr>
-                <w:sz w:val="18"/>
-                <w:szCs w:val="18"/>
-              </w:rPr>
-              <w:t>)</w:t>
-            </w:r>
-            <w:r>
-              <w:rPr>
-                <w:sz w:val="18"/>
-                <w:szCs w:val="18"/>
-              </w:rPr>
-              <w:t xml:space="preserve"> = Gate 1</w:t>
-            </w:r>
-            <w:r>
-              <w:rPr>
-                <w:sz w:val="18"/>
-                <w:szCs w:val="18"/>
-              </w:rPr>
-              <w:t>2</w:t>
+              <w:t>(2A)</w:t>
+            </w:r>
+            <w:r>
+              <w:rPr>
+                <w:sz w:val="18"/>
+                <w:szCs w:val="18"/>
+              </w:rPr>
+              <w:t xml:space="preserve"> = Gate 12</w:t>
             </w:r>
           </w:p>
           <w:p>
@@ -3995,14 +3341,7 @@
                 <w:sz w:val="18"/>
                 <w:szCs w:val="18"/>
               </w:rPr>
-              <w:t xml:space="preserve">1 = </w:t>
-            </w:r>
-            <w:r>
-              <w:rPr>
-                <w:sz w:val="18"/>
-                <w:szCs w:val="18"/>
-              </w:rPr>
-              <w:t>MIDI Note</w:t>
+              <w:t>1 = MIDI Note</w:t>
             </w:r>
           </w:p>
         </w:tc>
@@ -4072,36 +3411,22 @@
                 <w:sz w:val="18"/>
                 <w:szCs w:val="18"/>
               </w:rPr>
-              <w:t xml:space="preserve">2 = </w:t>
-            </w:r>
-            <w:r>
-              <w:rPr>
-                <w:sz w:val="18"/>
-                <w:szCs w:val="18"/>
-              </w:rPr>
-              <w:t>MIDI CC &gt; threshold</w:t>
-            </w:r>
-          </w:p>
-          <w:p>
-            <w:pPr>
-              <w:rPr>
-                <w:sz w:val="18"/>
-                <w:szCs w:val="18"/>
-              </w:rPr>
-            </w:pPr>
-            <w:r>
-              <w:rPr>
-                <w:sz w:val="18"/>
-                <w:szCs w:val="18"/>
-              </w:rPr>
-              <w:t xml:space="preserve">3 = </w:t>
-            </w:r>
-            <w:r>
-              <w:rPr>
-                <w:sz w:val="18"/>
-                <w:szCs w:val="18"/>
-              </w:rPr>
-              <w:t>MIDI CC &lt; threshold</w:t>
+              <w:t>2 = MIDI CC &gt; threshold</w:t>
+            </w:r>
+          </w:p>
+          <w:p>
+            <w:pPr>
+              <w:rPr>
+                <w:sz w:val="18"/>
+                <w:szCs w:val="18"/>
+              </w:rPr>
+            </w:pPr>
+            <w:r>
+              <w:rPr>
+                <w:sz w:val="18"/>
+                <w:szCs w:val="18"/>
+              </w:rPr>
+              <w:t>3 = MIDI CC &lt; threshold</w:t>
             </w:r>
           </w:p>
         </w:tc>
@@ -4207,21 +3532,7 @@
                 <w:sz w:val="18"/>
                 <w:szCs w:val="18"/>
               </w:rPr>
-              <w:t>(0</w:t>
-            </w:r>
-            <w:r>
-              <w:rPr>
-                <w:sz w:val="18"/>
-                <w:szCs w:val="18"/>
-              </w:rPr>
-              <w:t>C</w:t>
-            </w:r>
-            <w:r>
-              <w:rPr>
-                <w:sz w:val="18"/>
-                <w:szCs w:val="18"/>
-              </w:rPr>
-              <w:t>)</w:t>
+              <w:t>(0C)</w:t>
             </w:r>
             <w:r>
               <w:rPr>
@@ -4250,21 +3561,7 @@
                 <w:sz w:val="18"/>
                 <w:szCs w:val="18"/>
               </w:rPr>
-              <w:t>(0</w:t>
-            </w:r>
-            <w:r>
-              <w:rPr>
-                <w:sz w:val="18"/>
-                <w:szCs w:val="18"/>
-              </w:rPr>
-              <w:t>D</w:t>
-            </w:r>
-            <w:r>
-              <w:rPr>
-                <w:sz w:val="18"/>
-                <w:szCs w:val="18"/>
-              </w:rPr>
-              <w:t>)</w:t>
+              <w:t>(0D)</w:t>
             </w:r>
             <w:r>
               <w:rPr>
@@ -4293,21 +3590,7 @@
                 <w:sz w:val="18"/>
                 <w:szCs w:val="18"/>
               </w:rPr>
-              <w:t>(0</w:t>
-            </w:r>
-            <w:r>
-              <w:rPr>
-                <w:sz w:val="18"/>
-                <w:szCs w:val="18"/>
-              </w:rPr>
-              <w:t>E</w:t>
-            </w:r>
-            <w:r>
-              <w:rPr>
-                <w:sz w:val="18"/>
-                <w:szCs w:val="18"/>
-              </w:rPr>
-              <w:t>)</w:t>
+              <w:t>(0E)</w:t>
             </w:r>
             <w:r>
               <w:rPr>
@@ -4364,136 +3647,52 @@
                 <w:sz w:val="18"/>
                 <w:szCs w:val="18"/>
               </w:rPr>
-              <w:t>2</w:t>
-            </w:r>
-            <w:r>
-              <w:rPr>
-                <w:sz w:val="18"/>
-                <w:szCs w:val="18"/>
-              </w:rPr>
-              <w:t xml:space="preserve"> = </w:t>
-            </w:r>
-            <w:r>
-              <w:rPr>
-                <w:sz w:val="18"/>
-                <w:szCs w:val="18"/>
-              </w:rPr>
-              <w:t>second</w:t>
-            </w:r>
-            <w:r>
-              <w:rPr>
-                <w:sz w:val="18"/>
-                <w:szCs w:val="18"/>
-              </w:rPr>
-              <w:t xml:space="preserve"> note on</w:t>
-            </w:r>
-          </w:p>
-          <w:p>
-            <w:pPr>
-              <w:rPr>
-                <w:sz w:val="18"/>
-                <w:szCs w:val="18"/>
-              </w:rPr>
-            </w:pPr>
-            <w:r>
-              <w:rPr>
-                <w:sz w:val="18"/>
-                <w:szCs w:val="18"/>
-              </w:rPr>
-              <w:t>3</w:t>
-            </w:r>
-            <w:r>
-              <w:rPr>
-                <w:sz w:val="18"/>
-                <w:szCs w:val="18"/>
-              </w:rPr>
-              <w:t xml:space="preserve"> = </w:t>
-            </w:r>
-            <w:r>
-              <w:rPr>
-                <w:sz w:val="18"/>
-                <w:szCs w:val="18"/>
-              </w:rPr>
-              <w:t>third</w:t>
-            </w:r>
-            <w:r>
-              <w:rPr>
-                <w:sz w:val="18"/>
-                <w:szCs w:val="18"/>
-              </w:rPr>
-              <w:t xml:space="preserve"> note on</w:t>
-            </w:r>
-          </w:p>
-          <w:p>
-            <w:pPr>
-              <w:rPr>
-                <w:sz w:val="18"/>
-                <w:szCs w:val="18"/>
-              </w:rPr>
-            </w:pPr>
-            <w:r>
-              <w:rPr>
-                <w:sz w:val="18"/>
-                <w:szCs w:val="18"/>
-              </w:rPr>
-              <w:t>4</w:t>
-            </w:r>
-            <w:r>
-              <w:rPr>
-                <w:sz w:val="18"/>
-                <w:szCs w:val="18"/>
-              </w:rPr>
-              <w:t xml:space="preserve"> = </w:t>
-            </w:r>
-            <w:r>
-              <w:rPr>
-                <w:sz w:val="18"/>
-                <w:szCs w:val="18"/>
-              </w:rPr>
-              <w:t>fourth</w:t>
-            </w:r>
-            <w:r>
-              <w:rPr>
-                <w:sz w:val="18"/>
-                <w:szCs w:val="18"/>
-              </w:rPr>
-              <w:t xml:space="preserve"> note on</w:t>
-            </w:r>
-          </w:p>
-          <w:p>
-            <w:pPr>
-              <w:rPr>
-                <w:sz w:val="18"/>
-                <w:szCs w:val="18"/>
-              </w:rPr>
-            </w:pPr>
-            <w:r>
-              <w:rPr>
-                <w:sz w:val="18"/>
-                <w:szCs w:val="18"/>
-              </w:rPr>
-              <w:t>5</w:t>
-            </w:r>
-            <w:r>
-              <w:rPr>
-                <w:sz w:val="18"/>
-                <w:szCs w:val="18"/>
-              </w:rPr>
-              <w:t xml:space="preserve"> = </w:t>
-            </w:r>
-            <w:r>
-              <w:rPr>
-                <w:sz w:val="18"/>
-                <w:szCs w:val="18"/>
-              </w:rPr>
-              <w:t xml:space="preserve">any </w:t>
-            </w:r>
-            <w:r>
-              <w:rPr>
-                <w:sz w:val="18"/>
-                <w:szCs w:val="18"/>
-              </w:rPr>
-              <w:t>note on</w:t>
+              <w:t>2 = second note on</w:t>
+            </w:r>
+          </w:p>
+          <w:p>
+            <w:pPr>
+              <w:rPr>
+                <w:sz w:val="18"/>
+                <w:szCs w:val="18"/>
+              </w:rPr>
+            </w:pPr>
+            <w:r>
+              <w:rPr>
+                <w:sz w:val="18"/>
+                <w:szCs w:val="18"/>
+              </w:rPr>
+              <w:t>3 = third note on</w:t>
+            </w:r>
+          </w:p>
+          <w:p>
+            <w:pPr>
+              <w:rPr>
+                <w:sz w:val="18"/>
+                <w:szCs w:val="18"/>
+              </w:rPr>
+            </w:pPr>
+            <w:r>
+              <w:rPr>
+                <w:sz w:val="18"/>
+                <w:szCs w:val="18"/>
+              </w:rPr>
+              <w:t>4 = fourth note on</w:t>
+            </w:r>
+          </w:p>
+          <w:p>
+            <w:pPr>
+              <w:rPr>
+                <w:sz w:val="18"/>
+                <w:szCs w:val="18"/>
+              </w:rPr>
+            </w:pPr>
+            <w:r>
+              <w:rPr>
+                <w:sz w:val="18"/>
+                <w:szCs w:val="18"/>
+              </w:rPr>
+              <w:t>5 = any note on</w:t>
             </w:r>
           </w:p>
           <w:p>
@@ -4565,14 +3764,7 @@
                 <w:sz w:val="18"/>
                 <w:szCs w:val="18"/>
               </w:rPr>
-              <w:t xml:space="preserve"> = </w:t>
-            </w:r>
-            <w:r>
-              <w:rPr>
-                <w:sz w:val="18"/>
-                <w:szCs w:val="18"/>
-              </w:rPr>
-              <w:t>Clock Tick</w:t>
+              <w:t xml:space="preserve"> = Clock Tick</w:t>
             </w:r>
           </w:p>
           <w:p>
@@ -4594,35 +3786,14 @@
                 <w:sz w:val="18"/>
                 <w:szCs w:val="18"/>
               </w:rPr>
-              <w:t>(1</w:t>
-            </w:r>
-            <w:r>
-              <w:rPr>
-                <w:sz w:val="18"/>
-                <w:szCs w:val="18"/>
-              </w:rPr>
-              <w:t>5</w:t>
-            </w:r>
-            <w:r>
-              <w:rPr>
-                <w:sz w:val="18"/>
-                <w:szCs w:val="18"/>
-              </w:rPr>
-              <w:t>)</w:t>
-            </w:r>
-            <w:r>
-              <w:rPr>
-                <w:sz w:val="18"/>
-                <w:szCs w:val="18"/>
-              </w:rPr>
-              <w:t xml:space="preserve"> = </w:t>
-            </w:r>
-            <w:r>
-              <w:rPr>
-                <w:sz w:val="18"/>
-                <w:szCs w:val="18"/>
-              </w:rPr>
-              <w:t>Clock Run</w:t>
+              <w:t>(15)</w:t>
+            </w:r>
+            <w:r>
+              <w:rPr>
+                <w:sz w:val="18"/>
+                <w:szCs w:val="18"/>
+              </w:rPr>
+              <w:t xml:space="preserve"> = Clock Run</w:t>
             </w:r>
           </w:p>
           <w:p>
@@ -4644,35 +3815,14 @@
                 <w:sz w:val="18"/>
                 <w:szCs w:val="18"/>
               </w:rPr>
-              <w:t>(1</w:t>
-            </w:r>
-            <w:r>
-              <w:rPr>
-                <w:sz w:val="18"/>
-                <w:szCs w:val="18"/>
-              </w:rPr>
-              <w:t>6</w:t>
-            </w:r>
-            <w:r>
-              <w:rPr>
-                <w:sz w:val="18"/>
-                <w:szCs w:val="18"/>
-              </w:rPr>
-              <w:t>)</w:t>
-            </w:r>
-            <w:r>
-              <w:rPr>
-                <w:sz w:val="18"/>
-                <w:szCs w:val="18"/>
-              </w:rPr>
-              <w:t xml:space="preserve"> = </w:t>
-            </w:r>
-            <w:r>
-              <w:rPr>
-                <w:sz w:val="18"/>
-                <w:szCs w:val="18"/>
-              </w:rPr>
-              <w:t>Clock Start</w:t>
+              <w:t>(16)</w:t>
+            </w:r>
+            <w:r>
+              <w:rPr>
+                <w:sz w:val="18"/>
+                <w:szCs w:val="18"/>
+              </w:rPr>
+              <w:t xml:space="preserve"> = Clock Start</w:t>
             </w:r>
           </w:p>
           <w:p>
@@ -4694,35 +3844,14 @@
                 <w:sz w:val="18"/>
                 <w:szCs w:val="18"/>
               </w:rPr>
-              <w:t>(1</w:t>
-            </w:r>
-            <w:r>
-              <w:rPr>
-                <w:sz w:val="18"/>
-                <w:szCs w:val="18"/>
-              </w:rPr>
-              <w:t>7</w:t>
-            </w:r>
-            <w:r>
-              <w:rPr>
-                <w:sz w:val="18"/>
-                <w:szCs w:val="18"/>
-              </w:rPr>
-              <w:t>)</w:t>
-            </w:r>
-            <w:r>
-              <w:rPr>
-                <w:sz w:val="18"/>
-                <w:szCs w:val="18"/>
-              </w:rPr>
-              <w:t xml:space="preserve"> = </w:t>
-            </w:r>
-            <w:r>
-              <w:rPr>
-                <w:sz w:val="18"/>
-                <w:szCs w:val="18"/>
-              </w:rPr>
-              <w:t>Clock Stop</w:t>
+              <w:t>(17)</w:t>
+            </w:r>
+            <w:r>
+              <w:rPr>
+                <w:sz w:val="18"/>
+                <w:szCs w:val="18"/>
+              </w:rPr>
+              <w:t xml:space="preserve"> = Clock Stop</w:t>
             </w:r>
           </w:p>
           <w:p>
@@ -4744,35 +3873,14 @@
                 <w:sz w:val="18"/>
                 <w:szCs w:val="18"/>
               </w:rPr>
-              <w:t>(1</w:t>
-            </w:r>
-            <w:r>
-              <w:rPr>
-                <w:sz w:val="18"/>
-                <w:szCs w:val="18"/>
-              </w:rPr>
-              <w:t>8</w:t>
-            </w:r>
-            <w:r>
-              <w:rPr>
-                <w:sz w:val="18"/>
-                <w:szCs w:val="18"/>
-              </w:rPr>
-              <w:t>)</w:t>
-            </w:r>
-            <w:r>
-              <w:rPr>
-                <w:sz w:val="18"/>
-                <w:szCs w:val="18"/>
-              </w:rPr>
-              <w:t xml:space="preserve"> = </w:t>
-            </w:r>
-            <w:r>
-              <w:rPr>
-                <w:sz w:val="18"/>
-                <w:szCs w:val="18"/>
-              </w:rPr>
-              <w:t>Clock Start/Stop</w:t>
+              <w:t>(18)</w:t>
+            </w:r>
+            <w:r>
+              <w:rPr>
+                <w:sz w:val="18"/>
+                <w:szCs w:val="18"/>
+              </w:rPr>
+              <w:t xml:space="preserve"> = Clock Start/Stop</w:t>
             </w:r>
           </w:p>
         </w:tc>
@@ -5121,14 +4229,7 @@
                 <w:sz w:val="18"/>
                 <w:szCs w:val="18"/>
               </w:rPr>
-              <w:t>4 = Maximum</w:t>
-            </w:r>
-            <w:r>
-              <w:rPr>
-                <w:sz w:val="18"/>
-                <w:szCs w:val="18"/>
-              </w:rPr>
-              <w:t xml:space="preserve"> Note</w:t>
+              <w:t>4 = Maximum Note</w:t>
             </w:r>
           </w:p>
         </w:tc>
@@ -5393,21 +4494,7 @@
                 <w:sz w:val="18"/>
                 <w:szCs w:val="18"/>
               </w:rPr>
-              <w:t>(0</w:t>
-            </w:r>
-            <w:r>
-              <w:rPr>
-                <w:sz w:val="18"/>
-                <w:szCs w:val="18"/>
-              </w:rPr>
-              <w:t>C</w:t>
-            </w:r>
-            <w:r>
-              <w:rPr>
-                <w:sz w:val="18"/>
-                <w:szCs w:val="18"/>
-              </w:rPr>
-              <w:t>)</w:t>
+              <w:t>(0C)</w:t>
             </w:r>
             <w:r>
               <w:rPr>
@@ -5707,21 +4794,7 @@
                 <w:sz w:val="18"/>
                 <w:szCs w:val="18"/>
               </w:rPr>
-              <w:t>(0</w:t>
-            </w:r>
-            <w:r>
-              <w:rPr>
-                <w:sz w:val="18"/>
-                <w:szCs w:val="18"/>
-              </w:rPr>
-              <w:t>D</w:t>
-            </w:r>
-            <w:r>
-              <w:rPr>
-                <w:sz w:val="18"/>
-                <w:szCs w:val="18"/>
-              </w:rPr>
-              <w:t>)</w:t>
+              <w:t>(0D)</w:t>
             </w:r>
             <w:r>
               <w:rPr>
@@ -6016,21 +5089,7 @@
                 <w:sz w:val="18"/>
                 <w:szCs w:val="18"/>
               </w:rPr>
-              <w:t>(0</w:t>
-            </w:r>
-            <w:r>
-              <w:rPr>
-                <w:sz w:val="18"/>
-                <w:szCs w:val="18"/>
-              </w:rPr>
-              <w:t>C</w:t>
-            </w:r>
-            <w:r>
-              <w:rPr>
-                <w:sz w:val="18"/>
-                <w:szCs w:val="18"/>
-              </w:rPr>
-              <w:t>)</w:t>
+              <w:t>(0C)</w:t>
             </w:r>
             <w:r>
               <w:rPr>
@@ -6192,7 +5251,7 @@
 </file>
 
 <file path=word/styles.xml><?xml version="1.0" encoding="utf-8"?>
-<w:styles xmlns:mc="http://schemas.openxmlformats.org/markup-compatibility/2006" xmlns:r="http://schemas.openxmlformats.org/officeDocument/2006/relationships" xmlns:w="http://schemas.openxmlformats.org/wordprocessingml/2006/main" xmlns:w14="http://schemas.microsoft.com/office/word/2010/wordml" xmlns:w15="http://schemas.microsoft.com/office/word/2012/wordml" xmlns:w16cid="http://schemas.microsoft.com/office/word/2016/wordml/cid" xmlns:w16se="http://schemas.microsoft.com/office/word/2015/wordml/symex" mc:Ignorable="w14 w15 w16se w16cid">
+<w:styles xmlns:mc="http://schemas.openxmlformats.org/markup-compatibility/2006" xmlns:r="http://schemas.openxmlformats.org/officeDocument/2006/relationships" xmlns:w="http://schemas.openxmlformats.org/wordprocessingml/2006/main" xmlns:w14="http://schemas.microsoft.com/office/word/2010/wordml" xmlns:w15="http://schemas.microsoft.com/office/word/2012/wordml" xmlns:w16cex="http://schemas.microsoft.com/office/word/2018/wordml/cex" xmlns:w16cid="http://schemas.microsoft.com/office/word/2016/wordml/cid" xmlns:w16="http://schemas.microsoft.com/office/word/2018/wordml" xmlns:w16du="http://schemas.microsoft.com/office/word/2023/wordml/word16du" xmlns:w16sdtdh="http://schemas.microsoft.com/office/word/2020/wordml/sdtdatahash" xmlns:w16sdtfl="http://schemas.microsoft.com/office/word/2024/wordml/sdtformatlock" xmlns:w16se="http://schemas.microsoft.com/office/word/2015/wordml/symex" mc:Ignorable="w14 w15 w16se w16cid w16 w16cex w16sdtdh w16sdtfl w16du">
   <w:docDefaults>
     <w:rPrDefault>
       <w:rPr>
@@ -6208,7 +5267,7 @@
       </w:pPr>
     </w:pPrDefault>
   </w:docDefaults>
-  <w:latentStyles w:defLockedState="0" w:defUIPriority="99" w:defSemiHidden="0" w:defUnhideWhenUsed="0" w:defQFormat="0" w:count="375">
+  <w:latentStyles w:defLockedState="0" w:defUIPriority="99" w:defSemiHidden="0" w:defUnhideWhenUsed="0" w:defQFormat="0" w:count="376">
     <w:lsdException w:name="Normal" w:uiPriority="0" w:qFormat="1"/>
     <w:lsdException w:name="heading 1" w:uiPriority="9" w:qFormat="1"/>
     <w:lsdException w:name="heading 2" w:semiHidden="1" w:uiPriority="9" w:unhideWhenUsed="1" w:qFormat="1"/>
@@ -6584,6 +5643,7 @@
     <w:lsdException w:name="Smart Hyperlink" w:semiHidden="1" w:unhideWhenUsed="1"/>
     <w:lsdException w:name="Hashtag" w:semiHidden="1" w:unhideWhenUsed="1"/>
     <w:lsdException w:name="Unresolved Mention" w:semiHidden="1" w:unhideWhenUsed="1"/>
+    <w:lsdException w:name="Smart Link" w:semiHidden="1" w:unhideWhenUsed="1"/>
   </w:latentStyles>
   <w:style w:type="paragraph" w:default="1" w:styleId="Normal">
     <w:name w:val="Normal"/>

</xml_diff>